<commit_message>
check in in advance of sharing with pub
</commit_message>
<xml_diff>
--- a/docx_chapters/05_AAA - Considerations_for_Your_First_Hike.docx
+++ b/docx_chapters/05_AAA - Considerations_for_Your_First_Hike.docx
@@ -2,7 +2,7 @@
 <file path=word/document.xml><?xml version="1.0" encoding="utf-8"?>
 <w:document xmlns:w="http://schemas.openxmlformats.org/wordprocessingml/2006/main" xmlns:m="http://schemas.openxmlformats.org/officeDocument/2006/math" xmlns:r="http://schemas.openxmlformats.org/officeDocument/2006/relationships" xmlns:o="urn:schemas-microsoft-com:office:office" xmlns:v="urn:schemas-microsoft-com:vml" xmlns:w10="urn:schemas-microsoft-com:office:word" xmlns:a="http://schemas.openxmlformats.org/drawingml/2006/main" xmlns:pic="http://schemas.openxmlformats.org/drawingml/2006/picture" xmlns:wp="http://schemas.openxmlformats.org/drawingml/2006/wordprocessingDrawing">
   <w:body>
-    <w:bookmarkStart w:id="27" w:name="getting-ready-for-your-first-hike"/>
+    <w:bookmarkStart w:id="28" w:name="getting-ready-for-your-first-hike"/>
     <w:p>
       <w:pPr>
         <w:pStyle w:val="Heading2"/>
@@ -371,13 +371,13 @@
       </w:r>
     </w:p>
     <w:bookmarkEnd w:id="24"/>
-    <w:bookmarkStart w:id="25" w:name="embrace-serendipity"/>
+    <w:bookmarkStart w:id="25" w:name="check-before-you-go"/>
     <w:p>
       <w:pPr>
         <w:pStyle w:val="Heading3"/>
       </w:pPr>
       <w:r>
-        <w:t xml:space="preserve">Embrace serendipity</w:t>
+        <w:t xml:space="preserve">Check before you go</w:t>
       </w:r>
     </w:p>
     <w:p>
@@ -385,49 +385,15 @@
         <w:pStyle w:val="FirstParagraph"/>
       </w:pPr>
       <w:r>
-        <w:t xml:space="preserve">It’s good to have a plan, but don’t be surprised if something better comes along!</w:t>
-      </w:r>
-      <w:r>
-        <w:t xml:space="preserve"> </w:t>
-      </w:r>
-      <w:r>
-        <w:t xml:space="preserve">Maybe you hike further than you thought you would, or perhaps your child surprises you (and themselves!) by taking some time to rock hop across a creek, follow animal tracks, or look at plants and flowers.</w:t>
-      </w:r>
-      <w:r>
-        <w:t xml:space="preserve"> </w:t>
-      </w:r>
-      <w:r>
-        <w:t xml:space="preserve">Be ready to follow your child’s lead—whether that means stopping to watch a butterfly or counting animal tracks.</w:t>
-      </w:r>
-      <w:r>
-        <w:t xml:space="preserve"> </w:t>
-      </w:r>
-      <w:r>
-        <w:t xml:space="preserve">These moments often become the most cherished.</w:t>
-      </w:r>
-    </w:p>
-    <w:bookmarkEnd w:id="25"/>
-    <w:bookmarkStart w:id="26" w:name="select-advice"/>
-    <w:p>
-      <w:pPr>
-        <w:pStyle w:val="Heading3"/>
-      </w:pPr>
-      <w:r>
-        <w:t xml:space="preserve">Select advice</w:t>
-      </w:r>
-    </w:p>
-    <w:p>
-      <w:pPr>
-        <w:pStyle w:val="FirstParagraph"/>
-      </w:pPr>
-      <w:r>
-        <w:t xml:space="preserve">We asked some local hiking experts to share some additional advice.</w:t>
-      </w:r>
-      <w:r>
-        <w:t xml:space="preserve"> </w:t>
-      </w:r>
-      <w:r>
-        <w:t xml:space="preserve">Here’s what they said:</w:t>
+        <w:t xml:space="preserve">Trail access and conditions can change rapidly due to weather, maintenance, or seasonal closures, and—especially for the Great Smoky Mountains National Park—federal funding circumstances!</w:t>
+      </w:r>
+    </w:p>
+    <w:p>
+      <w:pPr>
+        <w:pStyle w:val="BodyText"/>
+      </w:pPr>
+      <w:r>
+        <w:t xml:space="preserve">Before heading out, consider the following:</w:t>
       </w:r>
     </w:p>
     <w:p>
@@ -439,13 +405,7 @@
         </w:numPr>
       </w:pPr>
       <w:r>
-        <w:t xml:space="preserve">“Kids need to find things they love on hiking.”</w:t>
-      </w:r>
-      <w:r>
-        <w:t xml:space="preserve"> </w:t>
-      </w:r>
-      <w:r>
-        <w:t xml:space="preserve">- Finn (3)</w:t>
+        <w:t xml:space="preserve">Visit official park websites for up-to-date trail status.</w:t>
       </w:r>
     </w:p>
     <w:p>
@@ -457,13 +417,7 @@
         </w:numPr>
       </w:pPr>
       <w:r>
-        <w:t xml:space="preserve">“Find rocks while hiking.”</w:t>
-      </w:r>
-      <w:r>
-        <w:t xml:space="preserve"> </w:t>
-      </w:r>
-      <w:r>
-        <w:t xml:space="preserve">- Ruth (5)</w:t>
+        <w:t xml:space="preserve">Call the local ranger station or visitor center to confirm access and hours.</w:t>
       </w:r>
     </w:p>
     <w:p>
@@ -475,13 +429,67 @@
         </w:numPr>
       </w:pPr>
       <w:r>
-        <w:t xml:space="preserve">“When possible, swim in the waterfalls.”</w:t>
-      </w:r>
-      <w:r>
-        <w:t xml:space="preserve"> </w:t>
-      </w:r>
-      <w:r>
-        <w:t xml:space="preserve">- Ruth (5)</w:t>
+        <w:t xml:space="preserve">Review recent weather forecasts and trail reports for hazards.</w:t>
+      </w:r>
+    </w:p>
+    <w:bookmarkEnd w:id="25"/>
+    <w:bookmarkStart w:id="26" w:name="embrace-serendipity"/>
+    <w:p>
+      <w:pPr>
+        <w:pStyle w:val="Heading3"/>
+      </w:pPr>
+      <w:r>
+        <w:t xml:space="preserve">Embrace serendipity</w:t>
+      </w:r>
+    </w:p>
+    <w:p>
+      <w:pPr>
+        <w:pStyle w:val="FirstParagraph"/>
+      </w:pPr>
+      <w:r>
+        <w:t xml:space="preserve">It’s good to have a plan, but don’t be surprised if something better comes along!</w:t>
+      </w:r>
+      <w:r>
+        <w:t xml:space="preserve"> </w:t>
+      </w:r>
+      <w:r>
+        <w:t xml:space="preserve">Maybe you hike further than you thought you would, or perhaps your child surprises you (and themselves!) by taking some time to rock hop across a creek, follow animal tracks, or look at plants and flowers.</w:t>
+      </w:r>
+      <w:r>
+        <w:t xml:space="preserve"> </w:t>
+      </w:r>
+      <w:r>
+        <w:t xml:space="preserve">Be ready to follow your child’s lead—whether that means stopping to watch a butterfly or counting animal tracks.</w:t>
+      </w:r>
+      <w:r>
+        <w:t xml:space="preserve"> </w:t>
+      </w:r>
+      <w:r>
+        <w:t xml:space="preserve">These moments often become the most cherished.</w:t>
+      </w:r>
+    </w:p>
+    <w:bookmarkEnd w:id="26"/>
+    <w:bookmarkStart w:id="27" w:name="select-advice"/>
+    <w:p>
+      <w:pPr>
+        <w:pStyle w:val="Heading3"/>
+      </w:pPr>
+      <w:r>
+        <w:t xml:space="preserve">Select advice</w:t>
+      </w:r>
+    </w:p>
+    <w:p>
+      <w:pPr>
+        <w:pStyle w:val="FirstParagraph"/>
+      </w:pPr>
+      <w:r>
+        <w:t xml:space="preserve">We asked some local hiking experts to share some additional advice.</w:t>
+      </w:r>
+      <w:r>
+        <w:t xml:space="preserve"> </w:t>
+      </w:r>
+      <w:r>
+        <w:t xml:space="preserve">Here’s what they said:</w:t>
       </w:r>
     </w:p>
     <w:p>
@@ -489,17 +497,17 @@
         <w:pStyle w:val="Compact"/>
         <w:numPr>
           <w:ilvl w:val="0"/>
-          <w:numId w:val="1003"/>
+          <w:numId w:val="1004"/>
         </w:numPr>
       </w:pPr>
       <w:r>
-        <w:t xml:space="preserve">“It’s important to go off the trail.”</w:t>
-      </w:r>
-      <w:r>
-        <w:t xml:space="preserve"> </w:t>
-      </w:r>
-      <w:r>
-        <w:t xml:space="preserve">- Ruth (5)</w:t>
+        <w:t xml:space="preserve">“Kids need to find things they love on hiking.”</w:t>
+      </w:r>
+      <w:r>
+        <w:t xml:space="preserve"> </w:t>
+      </w:r>
+      <w:r>
+        <w:t xml:space="preserve">- Finn (3)</w:t>
       </w:r>
     </w:p>
     <w:p>
@@ -507,17 +515,17 @@
         <w:pStyle w:val="Compact"/>
         <w:numPr>
           <w:ilvl w:val="0"/>
-          <w:numId w:val="1003"/>
+          <w:numId w:val="1004"/>
         </w:numPr>
       </w:pPr>
       <w:r>
-        <w:t xml:space="preserve">“If your baby can walk a little bit, then let them walk.”</w:t>
-      </w:r>
-      <w:r>
-        <w:t xml:space="preserve"> </w:t>
-      </w:r>
-      <w:r>
-        <w:t xml:space="preserve">- Jonah (age 6)</w:t>
+        <w:t xml:space="preserve">“Find rocks while hiking.”</w:t>
+      </w:r>
+      <w:r>
+        <w:t xml:space="preserve"> </w:t>
+      </w:r>
+      <w:r>
+        <w:t xml:space="preserve">- Ruth (5)</w:t>
       </w:r>
     </w:p>
     <w:p>
@@ -525,17 +533,17 @@
         <w:pStyle w:val="Compact"/>
         <w:numPr>
           <w:ilvl w:val="0"/>
-          <w:numId w:val="1003"/>
+          <w:numId w:val="1004"/>
         </w:numPr>
       </w:pPr>
       <w:r>
-        <w:t xml:space="preserve">“Make sure to run and also look for bears.”</w:t>
-      </w:r>
-      <w:r>
-        <w:t xml:space="preserve"> </w:t>
-      </w:r>
-      <w:r>
-        <w:t xml:space="preserve">- Levi (7)</w:t>
+        <w:t xml:space="preserve">“When possible, swim in the waterfalls.”</w:t>
+      </w:r>
+      <w:r>
+        <w:t xml:space="preserve"> </w:t>
+      </w:r>
+      <w:r>
+        <w:t xml:space="preserve">- Ruth (5)</w:t>
       </w:r>
     </w:p>
     <w:p>
@@ -543,17 +551,17 @@
         <w:pStyle w:val="Compact"/>
         <w:numPr>
           <w:ilvl w:val="0"/>
-          <w:numId w:val="1003"/>
+          <w:numId w:val="1004"/>
         </w:numPr>
       </w:pPr>
       <w:r>
-        <w:t xml:space="preserve">“You might want to bring pants and a sweatshirt with a hood. Because that one time I brought no pants and a sweatshirt with no hood.”</w:t>
-      </w:r>
-      <w:r>
-        <w:t xml:space="preserve"> </w:t>
-      </w:r>
-      <w:r>
-        <w:t xml:space="preserve">- G.H. (9)</w:t>
+        <w:t xml:space="preserve">“It’s important to go off the trail.”</w:t>
+      </w:r>
+      <w:r>
+        <w:t xml:space="preserve"> </w:t>
+      </w:r>
+      <w:r>
+        <w:t xml:space="preserve">- Ruth (5)</w:t>
       </w:r>
     </w:p>
     <w:p>
@@ -561,10 +569,64 @@
         <w:pStyle w:val="Compact"/>
         <w:numPr>
           <w:ilvl w:val="0"/>
-          <w:numId w:val="1003"/>
+          <w:numId w:val="1004"/>
         </w:numPr>
       </w:pPr>
       <w:r>
+        <w:t xml:space="preserve">“If your baby can walk a little bit, then let them walk.”</w:t>
+      </w:r>
+      <w:r>
+        <w:t xml:space="preserve"> </w:t>
+      </w:r>
+      <w:r>
+        <w:t xml:space="preserve">- Jonah (age 6)</w:t>
+      </w:r>
+    </w:p>
+    <w:p>
+      <w:pPr>
+        <w:pStyle w:val="Compact"/>
+        <w:numPr>
+          <w:ilvl w:val="0"/>
+          <w:numId w:val="1004"/>
+        </w:numPr>
+      </w:pPr>
+      <w:r>
+        <w:t xml:space="preserve">“Make sure to run and also look for bears.”</w:t>
+      </w:r>
+      <w:r>
+        <w:t xml:space="preserve"> </w:t>
+      </w:r>
+      <w:r>
+        <w:t xml:space="preserve">- Levi (7)</w:t>
+      </w:r>
+    </w:p>
+    <w:p>
+      <w:pPr>
+        <w:pStyle w:val="Compact"/>
+        <w:numPr>
+          <w:ilvl w:val="0"/>
+          <w:numId w:val="1004"/>
+        </w:numPr>
+      </w:pPr>
+      <w:r>
+        <w:t xml:space="preserve">“You might want to bring pants and a sweatshirt with a hood. Because that one time I brought no pants and a sweatshirt with no hood.”</w:t>
+      </w:r>
+      <w:r>
+        <w:t xml:space="preserve"> </w:t>
+      </w:r>
+      <w:r>
+        <w:t xml:space="preserve">- G.H. (9)</w:t>
+      </w:r>
+    </w:p>
+    <w:p>
+      <w:pPr>
+        <w:pStyle w:val="Compact"/>
+        <w:numPr>
+          <w:ilvl w:val="0"/>
+          <w:numId w:val="1004"/>
+        </w:numPr>
+      </w:pPr>
+      <w:r>
         <w:t xml:space="preserve">“Games and stories are better when made up on the fly.”</w:t>
       </w:r>
       <w:r>
@@ -582,8 +644,8 @@
         <w:t xml:space="preserve">The next chapter offers some guidance on how to pick a trail (and how to use this book).</w:t>
       </w:r>
     </w:p>
-    <w:bookmarkEnd w:id="26"/>
     <w:bookmarkEnd w:id="27"/>
+    <w:bookmarkEnd w:id="28"/>
     <w:sectPr>
       <w:footnotePr>
         <w:numRestart w:val="eachSect"/>
@@ -807,6 +869,9 @@
     <w:abstractNumId w:val="991"/>
   </w:num>
   <w:num w:numId="1003">
+    <w:abstractNumId w:val="991"/>
+  </w:num>
+  <w:num w:numId="1004">
     <w:abstractNumId w:val="991"/>
   </w:num>
 </w:numbering>

</xml_diff>